<commit_message>
Fotos en Historia y Ciencias, y Guia 5 completada
</commit_message>
<xml_diff>
--- a/03-Ciencias.docx
+++ b/03-Ciencias.docx
@@ -2,7 +2,7 @@
 <file path=word/document.xml><?xml version="1.0" encoding="utf-8"?>
 <w:document xmlns:w="http://schemas.openxmlformats.org/wordprocessingml/2006/main" xmlns:m="http://schemas.openxmlformats.org/officeDocument/2006/math" xmlns:r="http://schemas.openxmlformats.org/officeDocument/2006/relationships" xmlns:o="urn:schemas-microsoft-com:office:office" xmlns:v="urn:schemas-microsoft-com:vml" xmlns:w10="urn:schemas-microsoft-com:office:word" xmlns:a="http://schemas.openxmlformats.org/drawingml/2006/main" xmlns:pic="http://schemas.openxmlformats.org/drawingml/2006/picture" xmlns:wp="http://schemas.openxmlformats.org/drawingml/2006/wordprocessingDrawing">
   <w:body>
-    <w:bookmarkStart w:id="51" w:name="guía-3-ciencias-naturales"/>
+    <w:bookmarkStart w:id="63" w:name="guía-3-ciencias-naturales"/>
     <w:p>
       <w:pPr>
         <w:pStyle w:val="Heading1"/>
@@ -287,7 +287,7 @@
     </w:p>
     <w:bookmarkEnd w:id="20"/>
     <w:bookmarkEnd w:id="21"/>
-    <w:bookmarkStart w:id="27" w:name="sección-1-los-hábitos-de-vida-saludable"/>
+    <w:bookmarkStart w:id="30" w:name="sección-1-los-hábitos-de-vida-saludable"/>
     <w:p>
       <w:pPr>
         <w:pStyle w:val="Heading2"/>
@@ -320,7 +320,7 @@
         <w:t xml:space="preserve">es una conducta que se repite tantas veces que termina saliendo sola. Los hábitos saludables son los que mantienen el cuerpo y la mente funcionando bien a lo largo del tiempo.</w:t>
       </w:r>
     </w:p>
-    <w:bookmarkStart w:id="22" w:name="los-cinco-pilares"/>
+    <w:bookmarkStart w:id="25" w:name="los-cinco-pilares"/>
     <w:p>
       <w:pPr>
         <w:pStyle w:val="Heading3"/>
@@ -573,8 +573,63 @@
         </w:tc>
       </w:tr>
     </w:tbl>
-    <w:bookmarkEnd w:id="22"/>
-    <w:bookmarkStart w:id="23" w:name="lo-que-ocurre-cuando-faltan"/>
+    <w:p>
+      <w:pPr>
+        <w:pStyle w:val="CaptionedFigure"/>
+      </w:pPr>
+      <w:r>
+        <w:drawing>
+          <wp:inline>
+            <wp:extent cx="5334000" cy="3561396"/>
+            <wp:effectExtent b="0" l="0" r="0" t="0"/>
+            <wp:docPr descr="Frutas y verduras de distintos colores. La recomendación son cinco porciones al día, y mientras más colores distintos, más variados los nutrientes. Foto del USDA, dominio público." title="" id="23" name="Picture"/>
+            <a:graphic>
+              <a:graphicData uri="http://schemas.openxmlformats.org/drawingml/2006/picture">
+                <pic:pic>
+                  <pic:nvPicPr>
+                    <pic:cNvPr descr="imagenes/frutas-verduras.jpg" id="24" name="Picture"/>
+                    <pic:cNvPicPr>
+                      <a:picLocks noChangeArrowheads="1" noChangeAspect="1"/>
+                    </pic:cNvPicPr>
+                  </pic:nvPicPr>
+                  <pic:blipFill>
+                    <a:blip r:embed="rId22"/>
+                    <a:stretch>
+                      <a:fillRect/>
+                    </a:stretch>
+                  </pic:blipFill>
+                  <pic:spPr bwMode="auto">
+                    <a:xfrm>
+                      <a:off x="0" y="0"/>
+                      <a:ext cx="5334000" cy="3561396"/>
+                    </a:xfrm>
+                    <a:prstGeom prst="rect">
+                      <a:avLst/>
+                    </a:prstGeom>
+                    <a:noFill/>
+                    <a:ln w="9525">
+                      <a:noFill/>
+                      <a:headEnd/>
+                      <a:tailEnd/>
+                    </a:ln>
+                  </pic:spPr>
+                </pic:pic>
+              </a:graphicData>
+            </a:graphic>
+          </wp:inline>
+        </w:drawing>
+      </w:r>
+    </w:p>
+    <w:p>
+      <w:pPr>
+        <w:pStyle w:val="ImageCaption"/>
+      </w:pPr>
+      <w:r>
+        <w:t xml:space="preserve">Frutas y verduras de distintos colores. La recomendación son cinco porciones al día, y mientras más colores distintos, más variados los nutrientes. Foto del USDA, dominio público.</w:t>
+      </w:r>
+    </w:p>
+    <w:bookmarkEnd w:id="25"/>
+    <w:bookmarkStart w:id="26" w:name="lo-que-ocurre-cuando-faltan"/>
     <w:p>
       <w:pPr>
         <w:pStyle w:val="Heading3"/>
@@ -604,8 +659,8 @@
         <w:t xml:space="preserve">, sobrepeso, cansancio, dificultad para concentrarse y mayor riesgo de enfermedades cardiovasculares en la vida adulta. En Chile, el Ministerio de Salud identifica la obesidad infantil como uno de los principales problemas de salud pública escolar.</w:t>
       </w:r>
     </w:p>
-    <w:bookmarkEnd w:id="23"/>
-    <w:bookmarkStart w:id="25" w:name="actividad-física-no-es-solo-deporte"/>
+    <w:bookmarkEnd w:id="26"/>
+    <w:bookmarkStart w:id="28" w:name="actividad-física-no-es-solo-deporte"/>
     <w:p>
       <w:pPr>
         <w:pStyle w:val="Heading3"/>
@@ -635,7 +690,7 @@
         <w:t xml:space="preserve">, no una sola sesión.</w:t>
       </w:r>
     </w:p>
-    <w:bookmarkStart w:id="24" w:name="palabras-nuevas-1"/>
+    <w:bookmarkStart w:id="27" w:name="palabras-nuevas-1"/>
     <w:p>
       <w:pPr>
         <w:pStyle w:val="Heading4"/>
@@ -734,9 +789,9 @@
         <w:t xml:space="preserve">Una enfermedad del corazón o de los tubos por donde corre la sangre. Aparece sobre todo en adultos que se movieron poco y comieron mal por muchos años.</w:t>
       </w:r>
     </w:p>
-    <w:bookmarkEnd w:id="24"/>
-    <w:bookmarkEnd w:id="25"/>
-    <w:bookmarkStart w:id="26" w:name="ahora-tú"/>
+    <w:bookmarkEnd w:id="27"/>
+    <w:bookmarkEnd w:id="28"/>
+    <w:bookmarkStart w:id="29" w:name="ahora-tú"/>
     <w:p>
       <w:pPr>
         <w:pStyle w:val="Heading3"/>
@@ -812,9 +867,9 @@
         </w:pict>
       </w:r>
     </w:p>
-    <w:bookmarkEnd w:id="26"/>
-    <w:bookmarkEnd w:id="27"/>
-    <w:bookmarkStart w:id="33" w:name="X19ea3b61d87f5f9226425313cd31c8bc9a16150"/>
+    <w:bookmarkEnd w:id="29"/>
+    <w:bookmarkEnd w:id="30"/>
+    <w:bookmarkStart w:id="39" w:name="X19ea3b61d87f5f9226425313cd31c8bc9a16150"/>
     <w:p>
       <w:pPr>
         <w:pStyle w:val="Heading2"/>
@@ -835,7 +890,7 @@
         <w:t xml:space="preserve">”</w:t>
       </w:r>
     </w:p>
-    <w:bookmarkStart w:id="28" w:name="X7b551b423bf43093a3adbb29bc65c57c511b5c4"/>
+    <w:bookmarkStart w:id="31" w:name="X7b551b423bf43093a3adbb29bc65c57c511b5c4"/>
     <w:p>
       <w:pPr>
         <w:pStyle w:val="Heading3"/>
@@ -1126,8 +1181,8 @@
         </w:tc>
       </w:tr>
     </w:tbl>
-    <w:bookmarkEnd w:id="28"/>
-    <w:bookmarkStart w:id="29" w:name="el-etiquetado-chileno"/>
+    <w:bookmarkEnd w:id="31"/>
+    <w:bookmarkStart w:id="35" w:name="el-etiquetado-chileno"/>
     <w:p>
       <w:pPr>
         <w:pStyle w:val="Heading3"/>
@@ -1271,8 +1326,63 @@
         <w:t xml:space="preserve">. Además, la ley prohíbe vender estos productos dentro de los colegios y usar dibujos animados para promocionarlos a niños.</w:t>
       </w:r>
     </w:p>
-    <w:bookmarkEnd w:id="29"/>
-    <w:bookmarkStart w:id="31" w:name="cómo-leer-un-envase"/>
+    <w:p>
+      <w:pPr>
+        <w:pStyle w:val="CaptionedFigure"/>
+      </w:pPr>
+      <w:r>
+        <w:drawing>
+          <wp:inline>
+            <wp:extent cx="5334000" cy="1459831"/>
+            <wp:effectExtent b="0" l="0" r="0" t="0"/>
+            <wp:docPr descr="Los cuatro sellos de advertencia que exige la ley chilena. Un producto puede llevar uno, varios o ninguno. Recreación hecha para esta guía." title="" id="33" name="Picture"/>
+            <a:graphic>
+              <a:graphicData uri="http://schemas.openxmlformats.org/drawingml/2006/picture">
+                <pic:pic>
+                  <pic:nvPicPr>
+                    <pic:cNvPr descr="imagenes/sellos-alto-en.png" id="34" name="Picture"/>
+                    <pic:cNvPicPr>
+                      <a:picLocks noChangeArrowheads="1" noChangeAspect="1"/>
+                    </pic:cNvPicPr>
+                  </pic:nvPicPr>
+                  <pic:blipFill>
+                    <a:blip r:embed="rId32"/>
+                    <a:stretch>
+                      <a:fillRect/>
+                    </a:stretch>
+                  </pic:blipFill>
+                  <pic:spPr bwMode="auto">
+                    <a:xfrm>
+                      <a:off x="0" y="0"/>
+                      <a:ext cx="5334000" cy="1459831"/>
+                    </a:xfrm>
+                    <a:prstGeom prst="rect">
+                      <a:avLst/>
+                    </a:prstGeom>
+                    <a:noFill/>
+                    <a:ln w="9525">
+                      <a:noFill/>
+                      <a:headEnd/>
+                      <a:tailEnd/>
+                    </a:ln>
+                  </pic:spPr>
+                </pic:pic>
+              </a:graphicData>
+            </a:graphic>
+          </wp:inline>
+        </w:drawing>
+      </w:r>
+    </w:p>
+    <w:p>
+      <w:pPr>
+        <w:pStyle w:val="ImageCaption"/>
+      </w:pPr>
+      <w:r>
+        <w:t xml:space="preserve">Los cuatro sellos de advertencia que exige la ley chilena. Un producto puede llevar uno, varios o ninguno. Recreación hecha para esta guía.</w:t>
+      </w:r>
+    </w:p>
+    <w:bookmarkEnd w:id="35"/>
+    <w:bookmarkStart w:id="37" w:name="cómo-leer-un-envase"/>
     <w:p>
       <w:pPr>
         <w:pStyle w:val="Heading3"/>
@@ -1317,7 +1427,7 @@
         <w:t xml:space="preserve">Mirar la porción: la información nutricional suele estar calculada por porción, no por envase completo.</w:t>
       </w:r>
     </w:p>
-    <w:bookmarkStart w:id="30" w:name="palabras-nuevas-2"/>
+    <w:bookmarkStart w:id="36" w:name="palabras-nuevas-2"/>
     <w:p>
       <w:pPr>
         <w:pStyle w:val="Heading4"/>
@@ -1416,9 +1526,9 @@
         <w:t xml:space="preserve">La cantidad que se supone que comes de una vez, no todo el paquete. Un envase de galletas puede traer cuatro porciones adentro.</w:t>
       </w:r>
     </w:p>
-    <w:bookmarkEnd w:id="30"/>
-    <w:bookmarkEnd w:id="31"/>
-    <w:bookmarkStart w:id="32" w:name="ahora-tú-1"/>
+    <w:bookmarkEnd w:id="36"/>
+    <w:bookmarkEnd w:id="37"/>
+    <w:bookmarkStart w:id="38" w:name="ahora-tú-1"/>
     <w:p>
       <w:pPr>
         <w:pStyle w:val="Heading3"/>
@@ -1534,9 +1644,9 @@
         </w:pict>
       </w:r>
     </w:p>
-    <w:bookmarkEnd w:id="32"/>
-    <w:bookmarkEnd w:id="33"/>
-    <w:bookmarkStart w:id="39" w:name="sección-3-armar-un-menú-saludable"/>
+    <w:bookmarkEnd w:id="38"/>
+    <w:bookmarkEnd w:id="39"/>
+    <w:bookmarkStart w:id="48" w:name="sección-3-armar-un-menú-saludable"/>
     <w:p>
       <w:pPr>
         <w:pStyle w:val="Heading2"/>
@@ -1545,7 +1655,7 @@
         <w:t xml:space="preserve">Sección 3 · Armar un menú saludable</w:t>
       </w:r>
     </w:p>
-    <w:bookmarkStart w:id="34" w:name="el-modelo-del-plato"/>
+    <w:bookmarkStart w:id="43" w:name="el-modelo-del-plato"/>
     <w:p>
       <w:pPr>
         <w:pStyle w:val="Heading3"/>
@@ -1759,8 +1869,63 @@
         <w:t xml:space="preserve">Aquí las fracciones de Matemáticas aparecen en la vida real: 1/2 + 1/4 + 1/4 = 1 plato completo.</w:t>
       </w:r>
     </w:p>
-    <w:bookmarkEnd w:id="34"/>
-    <w:bookmarkStart w:id="35" w:name="las-cuatro-comidas-del-día"/>
+    <w:p>
+      <w:pPr>
+        <w:pStyle w:val="CaptionedFigure"/>
+      </w:pPr>
+      <w:r>
+        <w:drawing>
+          <wp:inline>
+            <wp:extent cx="5334000" cy="3426218"/>
+            <wp:effectExtent b="0" l="0" r="0" t="0"/>
+            <wp:docPr descr="Un almuerzo armado según el modelo del plato: la mitad verduras, un cuarto proteína y un cuarto cereales o papas. Foto del USDA, dominio público." title="" id="41" name="Picture"/>
+            <a:graphic>
+              <a:graphicData uri="http://schemas.openxmlformats.org/drawingml/2006/picture">
+                <pic:pic>
+                  <pic:nvPicPr>
+                    <pic:cNvPr descr="imagenes/plato-completo.jpg" id="42" name="Picture"/>
+                    <pic:cNvPicPr>
+                      <a:picLocks noChangeArrowheads="1" noChangeAspect="1"/>
+                    </pic:cNvPicPr>
+                  </pic:nvPicPr>
+                  <pic:blipFill>
+                    <a:blip r:embed="rId40"/>
+                    <a:stretch>
+                      <a:fillRect/>
+                    </a:stretch>
+                  </pic:blipFill>
+                  <pic:spPr bwMode="auto">
+                    <a:xfrm>
+                      <a:off x="0" y="0"/>
+                      <a:ext cx="5334000" cy="3426218"/>
+                    </a:xfrm>
+                    <a:prstGeom prst="rect">
+                      <a:avLst/>
+                    </a:prstGeom>
+                    <a:noFill/>
+                    <a:ln w="9525">
+                      <a:noFill/>
+                      <a:headEnd/>
+                      <a:tailEnd/>
+                    </a:ln>
+                  </pic:spPr>
+                </pic:pic>
+              </a:graphicData>
+            </a:graphic>
+          </wp:inline>
+        </w:drawing>
+      </w:r>
+    </w:p>
+    <w:p>
+      <w:pPr>
+        <w:pStyle w:val="ImageCaption"/>
+      </w:pPr>
+      <w:r>
+        <w:t xml:space="preserve">Un almuerzo armado según el modelo del plato: la mitad verduras, un cuarto proteína y un cuarto cereales o papas. Foto del USDA, dominio público.</w:t>
+      </w:r>
+    </w:p>
+    <w:bookmarkEnd w:id="43"/>
+    <w:bookmarkStart w:id="44" w:name="las-cuatro-comidas-del-día"/>
     <w:p>
       <w:pPr>
         <w:pStyle w:val="Heading3"/>
@@ -1975,8 +2140,8 @@
         </w:tc>
       </w:tr>
     </w:tbl>
-    <w:bookmarkEnd w:id="35"/>
-    <w:bookmarkStart w:id="37" w:name="errores-frecuentes-al-armar-un-menú"/>
+    <w:bookmarkEnd w:id="44"/>
+    <w:bookmarkStart w:id="46" w:name="errores-frecuentes-al-armar-un-menú"/>
     <w:p>
       <w:pPr>
         <w:pStyle w:val="Heading3"/>
@@ -2100,7 +2265,7 @@
         <w:t xml:space="preserve">. Hay que revisar el envase.</w:t>
       </w:r>
     </w:p>
-    <w:bookmarkStart w:id="36" w:name="palabras-nuevas-3"/>
+    <w:bookmarkStart w:id="45" w:name="palabras-nuevas-3"/>
     <w:p>
       <w:pPr>
         <w:pStyle w:val="Heading4"/>
@@ -2199,9 +2364,9 @@
         <w:t xml:space="preserve">Ponerle un nombre o una etiqueta a cada parte de un dibujo, para que se entienda qué es cada cosa.</w:t>
       </w:r>
     </w:p>
-    <w:bookmarkEnd w:id="36"/>
-    <w:bookmarkEnd w:id="37"/>
-    <w:bookmarkStart w:id="38" w:name="ahora-tú-2"/>
+    <w:bookmarkEnd w:id="45"/>
+    <w:bookmarkEnd w:id="46"/>
+    <w:bookmarkStart w:id="47" w:name="ahora-tú-2"/>
     <w:p>
       <w:pPr>
         <w:pStyle w:val="Heading3"/>
@@ -2321,9 +2486,9 @@
         </w:pict>
       </w:r>
     </w:p>
-    <w:bookmarkEnd w:id="38"/>
-    <w:bookmarkEnd w:id="39"/>
-    <w:bookmarkStart w:id="46" w:name="sección-4-los-efectos-del-cigarrillo"/>
+    <w:bookmarkEnd w:id="47"/>
+    <w:bookmarkEnd w:id="48"/>
+    <w:bookmarkStart w:id="58" w:name="sección-4-los-efectos-del-cigarrillo"/>
     <w:p>
       <w:pPr>
         <w:pStyle w:val="Heading2"/>
@@ -2332,7 +2497,7 @@
         <w:t xml:space="preserve">Sección 4 · Los efectos del cigarrillo</w:t>
       </w:r>
     </w:p>
-    <w:bookmarkStart w:id="40" w:name="qué-hay-dentro-del-humo"/>
+    <w:bookmarkStart w:id="49" w:name="qué-hay-dentro-del-humo"/>
     <w:p>
       <w:pPr>
         <w:pStyle w:val="Heading3"/>
@@ -2480,8 +2645,8 @@
         </w:tc>
       </w:tr>
     </w:tbl>
-    <w:bookmarkEnd w:id="40"/>
-    <w:bookmarkStart w:id="41" w:name="qué-sistemas-se-dañan"/>
+    <w:bookmarkEnd w:id="49"/>
+    <w:bookmarkStart w:id="53" w:name="qué-sistemas-se-dañan"/>
     <w:p>
       <w:pPr>
         <w:pStyle w:val="Heading3"/>
@@ -2544,8 +2709,63 @@
         <w:t xml:space="preserve">mal aliento, dientes amarillos, menor sentido del gusto y del olfato, piel envejecida antes de tiempo y menos resistencia física al hacer deporte.</w:t>
       </w:r>
     </w:p>
-    <w:bookmarkEnd w:id="41"/>
-    <w:bookmarkStart w:id="42" w:name="el-fumador-pasivo"/>
+    <w:p>
+      <w:pPr>
+        <w:pStyle w:val="CaptionedFigure"/>
+      </w:pPr>
+      <w:r>
+        <w:drawing>
+          <wp:inline>
+            <wp:extent cx="4203700" cy="5588000"/>
+            <wp:effectExtent b="0" l="0" r="0" t="0"/>
+            <wp:docPr descr="Los pulmones y los bronquios que llevan el aire hasta los alvéolos. Es el sistema que más daña el humo del cigarrillo. Ilustración del NIH, dominio público." title="" id="51" name="Picture"/>
+            <a:graphic>
+              <a:graphicData uri="http://schemas.openxmlformats.org/drawingml/2006/picture">
+                <pic:pic>
+                  <pic:nvPicPr>
+                    <pic:cNvPr descr="imagenes/pulmones.png" id="52" name="Picture"/>
+                    <pic:cNvPicPr>
+                      <a:picLocks noChangeArrowheads="1" noChangeAspect="1"/>
+                    </pic:cNvPicPr>
+                  </pic:nvPicPr>
+                  <pic:blipFill>
+                    <a:blip r:embed="rId50"/>
+                    <a:stretch>
+                      <a:fillRect/>
+                    </a:stretch>
+                  </pic:blipFill>
+                  <pic:spPr bwMode="auto">
+                    <a:xfrm>
+                      <a:off x="0" y="0"/>
+                      <a:ext cx="4203700" cy="5588000"/>
+                    </a:xfrm>
+                    <a:prstGeom prst="rect">
+                      <a:avLst/>
+                    </a:prstGeom>
+                    <a:noFill/>
+                    <a:ln w="9525">
+                      <a:noFill/>
+                      <a:headEnd/>
+                      <a:tailEnd/>
+                    </a:ln>
+                  </pic:spPr>
+                </pic:pic>
+              </a:graphicData>
+            </a:graphic>
+          </wp:inline>
+        </w:drawing>
+      </w:r>
+    </w:p>
+    <w:p>
+      <w:pPr>
+        <w:pStyle w:val="ImageCaption"/>
+      </w:pPr>
+      <w:r>
+        <w:t xml:space="preserve">Los pulmones y los bronquios que llevan el aire hasta los alvéolos. Es el sistema que más daña el humo del cigarrillo. Ilustración del NIH, dominio público.</w:t>
+      </w:r>
+    </w:p>
+    <w:bookmarkEnd w:id="53"/>
+    <w:bookmarkStart w:id="54" w:name="el-fumador-pasivo"/>
     <w:p>
       <w:pPr>
         <w:pStyle w:val="Heading3"/>
@@ -2596,8 +2816,8 @@
         <w:t xml:space="preserve">, que modificó la Ley 19.419) prohíbe fumar en espacios cerrados de uso público, en establecimientos educacionales y de salud, en el transporte público y en los patios de los colegios. También obliga a los envases a llevar imágenes de advertencia.</w:t>
       </w:r>
     </w:p>
-    <w:bookmarkEnd w:id="42"/>
-    <w:bookmarkStart w:id="44" w:name="cómo-decir-que-no"/>
+    <w:bookmarkEnd w:id="54"/>
+    <w:bookmarkStart w:id="56" w:name="cómo-decir-que-no"/>
     <w:p>
       <w:pPr>
         <w:pStyle w:val="Heading3"/>
@@ -2745,7 +2965,7 @@
         <w:t xml:space="preserve">si la presión se repite.</w:t>
       </w:r>
     </w:p>
-    <w:bookmarkStart w:id="43" w:name="palabras-nuevas-4"/>
+    <w:bookmarkStart w:id="55" w:name="palabras-nuevas-4"/>
     <w:p>
       <w:pPr>
         <w:pStyle w:val="Heading4"/>
@@ -2844,9 +3064,9 @@
         <w:t xml:space="preserve">Unas bolsitas diminutas que están al final de los pulmones, donde el aire pasa a la sangre. Son como globitos que se inflan y desinflan al respirar.</w:t>
       </w:r>
     </w:p>
-    <w:bookmarkEnd w:id="43"/>
-    <w:bookmarkEnd w:id="44"/>
-    <w:bookmarkStart w:id="45" w:name="ahora-tú-3"/>
+    <w:bookmarkEnd w:id="55"/>
+    <w:bookmarkEnd w:id="56"/>
+    <w:bookmarkStart w:id="57" w:name="ahora-tú-3"/>
     <w:p>
       <w:pPr>
         <w:pStyle w:val="Heading3"/>
@@ -2946,9 +3166,9 @@
         </w:pict>
       </w:r>
     </w:p>
-    <w:bookmarkEnd w:id="45"/>
-    <w:bookmarkEnd w:id="46"/>
-    <w:bookmarkStart w:id="48" w:name="actividad-central-la-campaña-de-curso"/>
+    <w:bookmarkEnd w:id="57"/>
+    <w:bookmarkEnd w:id="58"/>
+    <w:bookmarkStart w:id="60" w:name="actividad-central-la-campaña-de-curso"/>
     <w:p>
       <w:pPr>
         <w:pStyle w:val="Heading2"/>
@@ -2957,7 +3177,7 @@
         <w:t xml:space="preserve">Actividad central · La campaña de curso</w:t>
       </w:r>
     </w:p>
-    <w:bookmarkStart w:id="47" w:name="palabras-nuevas-5"/>
+    <w:bookmarkStart w:id="59" w:name="palabras-nuevas-5"/>
     <w:p>
       <w:pPr>
         <w:pStyle w:val="Heading4"/>
@@ -3117,9 +3337,9 @@
         </w:pict>
       </w:r>
     </w:p>
-    <w:bookmarkEnd w:id="47"/>
-    <w:bookmarkEnd w:id="48"/>
-    <w:bookmarkStart w:id="50" w:name="evaluación-integradora"/>
+    <w:bookmarkEnd w:id="59"/>
+    <w:bookmarkEnd w:id="60"/>
+    <w:bookmarkStart w:id="62" w:name="evaluación-integradora"/>
     <w:p>
       <w:pPr>
         <w:pStyle w:val="Heading2"/>
@@ -3128,7 +3348,7 @@
         <w:t xml:space="preserve">Evaluación integradora</w:t>
       </w:r>
     </w:p>
-    <w:bookmarkStart w:id="49" w:name="palabras-nuevas-6"/>
+    <w:bookmarkStart w:id="61" w:name="palabras-nuevas-6"/>
     <w:p>
       <w:pPr>
         <w:pStyle w:val="Heading4"/>
@@ -3335,10 +3555,10 @@
         <w:br w:type="page"/>
       </w:r>
     </w:p>
-    <w:bookmarkEnd w:id="49"/>
-    <w:bookmarkEnd w:id="50"/>
-    <w:bookmarkEnd w:id="51"/>
-    <w:bookmarkStart w:id="60" w:name="solucionario-guía-3-ciencias-naturales"/>
+    <w:bookmarkEnd w:id="61"/>
+    <w:bookmarkEnd w:id="62"/>
+    <w:bookmarkEnd w:id="63"/>
+    <w:bookmarkStart w:id="72" w:name="solucionario-guía-3-ciencias-naturales"/>
     <w:p>
       <w:pPr>
         <w:pStyle w:val="Heading1"/>
@@ -3365,7 +3585,7 @@
         <w:t xml:space="preserve">Esta sección no debe entregarse junto con la guía de trabajo.</w:t>
       </w:r>
     </w:p>
-    <w:bookmarkStart w:id="52" w:name="diagnóstico-de-entrada-1"/>
+    <w:bookmarkStart w:id="64" w:name="diagnóstico-de-entrada-1"/>
     <w:p>
       <w:pPr>
         <w:pStyle w:val="Heading2"/>
@@ -3470,8 +3690,8 @@
         <w:t xml:space="preserve">Por la nicotina, que produce adicción.</w:t>
       </w:r>
     </w:p>
-    <w:bookmarkEnd w:id="52"/>
-    <w:bookmarkStart w:id="53" w:name="sección-1-ahora-tú"/>
+    <w:bookmarkEnd w:id="64"/>
+    <w:bookmarkStart w:id="65" w:name="sección-1-ahora-tú"/>
     <w:p>
       <w:pPr>
         <w:pStyle w:val="Heading2"/>
@@ -3540,8 +3760,8 @@
         <w:t xml:space="preserve">Respuesta personal. Se evalúa que registre datos concretos y los compare con las recomendaciones de la tabla.</w:t>
       </w:r>
     </w:p>
-    <w:bookmarkEnd w:id="53"/>
-    <w:bookmarkStart w:id="54" w:name="sección-2-ahora-tú"/>
+    <w:bookmarkEnd w:id="65"/>
+    <w:bookmarkStart w:id="66" w:name="sección-2-ahora-tú"/>
     <w:p>
       <w:pPr>
         <w:pStyle w:val="Heading2"/>
@@ -3622,8 +3842,8 @@
         <w:t xml:space="preserve">Respuesta personal. Se evalúa la observación correcta de los envases.</w:t>
       </w:r>
     </w:p>
-    <w:bookmarkEnd w:id="54"/>
-    <w:bookmarkStart w:id="55" w:name="sección-3-ahora-tú"/>
+    <w:bookmarkEnd w:id="66"/>
+    <w:bookmarkStart w:id="67" w:name="sección-3-ahora-tú"/>
     <w:p>
       <w:pPr>
         <w:pStyle w:val="Heading2"/>
@@ -3710,8 +3930,8 @@
         <w:t xml:space="preserve">Respuesta personal. Se evalúa que las cuatro comidas estén completas, que el almuerzo respete el modelo del plato y que aparezcan frutas y verduras en más de una comida.</w:t>
       </w:r>
     </w:p>
-    <w:bookmarkEnd w:id="55"/>
-    <w:bookmarkStart w:id="56" w:name="sección-4-ahora-tú"/>
+    <w:bookmarkEnd w:id="67"/>
+    <w:bookmarkStart w:id="68" w:name="sección-4-ahora-tú"/>
     <w:p>
       <w:pPr>
         <w:pStyle w:val="Heading2"/>
@@ -3804,8 +4024,8 @@
         <w:t xml:space="preserve">Respuesta abierta. Se evalúa que sean respuestas directas y sin justificaciones extensas.</w:t>
       </w:r>
     </w:p>
-    <w:bookmarkEnd w:id="56"/>
-    <w:bookmarkStart w:id="57" w:name="actividad-central"/>
+    <w:bookmarkEnd w:id="68"/>
+    <w:bookmarkStart w:id="69" w:name="actividad-central"/>
     <w:p>
       <w:pPr>
         <w:pStyle w:val="Heading2"/>
@@ -3993,8 +4213,8 @@
         </w:tc>
       </w:tr>
     </w:tbl>
-    <w:bookmarkEnd w:id="57"/>
-    <w:bookmarkStart w:id="58" w:name="evaluación-integradora-1"/>
+    <w:bookmarkEnd w:id="69"/>
+    <w:bookmarkStart w:id="70" w:name="evaluación-integradora-1"/>
     <w:p>
       <w:pPr>
         <w:pStyle w:val="Heading2"/>
@@ -4147,8 +4367,8 @@
         <w:t xml:space="preserve">Decir que no directamente, dar una razón propia, cambiar de tema o de lugar, rodearse de amigos que no fuman, contarle a un adulto de confianza.</w:t>
       </w:r>
     </w:p>
-    <w:bookmarkEnd w:id="58"/>
-    <w:bookmarkStart w:id="59" w:name="tabla-de-remediación"/>
+    <w:bookmarkEnd w:id="70"/>
+    <w:bookmarkStart w:id="71" w:name="tabla-de-remediación"/>
     <w:p>
       <w:pPr>
         <w:pStyle w:val="Heading2"/>
@@ -4419,8 +4639,8 @@
         <w:t xml:space="preserve">10 o más indica dominio del contenido; entre 7 y 9, repaso focalizado; menos de 7, rehacer las secciones marcadas.</w:t>
       </w:r>
     </w:p>
-    <w:bookmarkEnd w:id="59"/>
-    <w:bookmarkEnd w:id="60"/>
+    <w:bookmarkEnd w:id="71"/>
+    <w:bookmarkEnd w:id="72"/>
     <w:sectPr/>
   </w:body>
 </w:document>

</xml_diff>

<commit_message>
Ciencias con las nuevas laminas
</commit_message>
<xml_diff>
--- a/03-Ciencias.docx
+++ b/03-Ciencias.docx
@@ -2,7 +2,7 @@
 <file path=word/document.xml><?xml version="1.0" encoding="utf-8"?>
 <w:document xmlns:w="http://schemas.openxmlformats.org/wordprocessingml/2006/main" xmlns:m="http://schemas.openxmlformats.org/officeDocument/2006/math" xmlns:r="http://schemas.openxmlformats.org/officeDocument/2006/relationships" xmlns:o="urn:schemas-microsoft-com:office:office" xmlns:v="urn:schemas-microsoft-com:vml" xmlns:w10="urn:schemas-microsoft-com:office:word" xmlns:a="http://schemas.openxmlformats.org/drawingml/2006/main" xmlns:pic="http://schemas.openxmlformats.org/drawingml/2006/picture" xmlns:wp="http://schemas.openxmlformats.org/drawingml/2006/wordprocessingDrawing">
   <w:body>
-    <w:bookmarkStart w:id="63" w:name="guía-3-ciencias-naturales"/>
+    <w:bookmarkStart w:id="69" w:name="guía-3-ciencias-naturales"/>
     <w:p>
       <w:pPr>
         <w:pStyle w:val="Heading1"/>
@@ -869,7 +869,7 @@
     </w:p>
     <w:bookmarkEnd w:id="29"/>
     <w:bookmarkEnd w:id="30"/>
-    <w:bookmarkStart w:id="39" w:name="X19ea3b61d87f5f9226425313cd31c8bc9a16150"/>
+    <w:bookmarkStart w:id="42" w:name="X19ea3b61d87f5f9226425313cd31c8bc9a16150"/>
     <w:p>
       <w:pPr>
         <w:pStyle w:val="Heading2"/>
@@ -890,7 +890,7 @@
         <w:t xml:space="preserve">”</w:t>
       </w:r>
     </w:p>
-    <w:bookmarkStart w:id="31" w:name="X7b551b423bf43093a3adbb29bc65c57c511b5c4"/>
+    <w:bookmarkStart w:id="34" w:name="X7b551b423bf43093a3adbb29bc65c57c511b5c4"/>
     <w:p>
       <w:pPr>
         <w:pStyle w:val="Heading3"/>
@@ -1181,8 +1181,63 @@
         </w:tc>
       </w:tr>
     </w:tbl>
-    <w:bookmarkEnd w:id="31"/>
-    <w:bookmarkStart w:id="35" w:name="el-etiquetado-chileno"/>
+    <w:p>
+      <w:pPr>
+        <w:pStyle w:val="CaptionedFigure"/>
+      </w:pPr>
+      <w:r>
+        <w:drawing>
+          <wp:inline>
+            <wp:extent cx="5334000" cy="3017921"/>
+            <wp:effectExtent b="0" l="0" r="0" t="0"/>
+            <wp:docPr descr="Cada color de fruta o verdura aporta nutrientes distintos. Por eso la recomendación no es solo comer cinco porciones al día, sino que sean de colores variados. Lámina hecha para esta guía." title="" id="32" name="Picture"/>
+            <a:graphic>
+              <a:graphicData uri="http://schemas.openxmlformats.org/drawingml/2006/picture">
+                <pic:pic>
+                  <pic:nvPicPr>
+                    <pic:cNvPr descr="imagenes/frutas-por-color.png" id="33" name="Picture"/>
+                    <pic:cNvPicPr>
+                      <a:picLocks noChangeArrowheads="1" noChangeAspect="1"/>
+                    </pic:cNvPicPr>
+                  </pic:nvPicPr>
+                  <pic:blipFill>
+                    <a:blip r:embed="rId31"/>
+                    <a:stretch>
+                      <a:fillRect/>
+                    </a:stretch>
+                  </pic:blipFill>
+                  <pic:spPr bwMode="auto">
+                    <a:xfrm>
+                      <a:off x="0" y="0"/>
+                      <a:ext cx="5334000" cy="3017921"/>
+                    </a:xfrm>
+                    <a:prstGeom prst="rect">
+                      <a:avLst/>
+                    </a:prstGeom>
+                    <a:noFill/>
+                    <a:ln w="9525">
+                      <a:noFill/>
+                      <a:headEnd/>
+                      <a:tailEnd/>
+                    </a:ln>
+                  </pic:spPr>
+                </pic:pic>
+              </a:graphicData>
+            </a:graphic>
+          </wp:inline>
+        </w:drawing>
+      </w:r>
+    </w:p>
+    <w:p>
+      <w:pPr>
+        <w:pStyle w:val="ImageCaption"/>
+      </w:pPr>
+      <w:r>
+        <w:t xml:space="preserve">Cada color de fruta o verdura aporta nutrientes distintos. Por eso la recomendación no es solo comer cinco porciones al día, sino que sean de colores variados. Lámina hecha para esta guía.</w:t>
+      </w:r>
+    </w:p>
+    <w:bookmarkEnd w:id="34"/>
+    <w:bookmarkStart w:id="38" w:name="el-etiquetado-chileno"/>
     <w:p>
       <w:pPr>
         <w:pStyle w:val="Heading3"/>
@@ -1335,18 +1390,18 @@
           <wp:inline>
             <wp:extent cx="5334000" cy="1459831"/>
             <wp:effectExtent b="0" l="0" r="0" t="0"/>
-            <wp:docPr descr="Los cuatro sellos de advertencia que exige la ley chilena. Un producto puede llevar uno, varios o ninguno. Recreación hecha para esta guía." title="" id="33" name="Picture"/>
+            <wp:docPr descr="Los cuatro sellos de advertencia que exige la ley chilena. Un producto puede llevar uno, varios o ninguno. Recreación hecha para esta guía." title="" id="36" name="Picture"/>
             <a:graphic>
               <a:graphicData uri="http://schemas.openxmlformats.org/drawingml/2006/picture">
                 <pic:pic>
                   <pic:nvPicPr>
-                    <pic:cNvPr descr="imagenes/sellos-alto-en.png" id="34" name="Picture"/>
+                    <pic:cNvPr descr="imagenes/sellos-alto-en.png" id="37" name="Picture"/>
                     <pic:cNvPicPr>
                       <a:picLocks noChangeArrowheads="1" noChangeAspect="1"/>
                     </pic:cNvPicPr>
                   </pic:nvPicPr>
                   <pic:blipFill>
-                    <a:blip r:embed="rId32"/>
+                    <a:blip r:embed="rId35"/>
                     <a:stretch>
                       <a:fillRect/>
                     </a:stretch>
@@ -1381,8 +1436,8 @@
         <w:t xml:space="preserve">Los cuatro sellos de advertencia que exige la ley chilena. Un producto puede llevar uno, varios o ninguno. Recreación hecha para esta guía.</w:t>
       </w:r>
     </w:p>
-    <w:bookmarkEnd w:id="35"/>
-    <w:bookmarkStart w:id="37" w:name="cómo-leer-un-envase"/>
+    <w:bookmarkEnd w:id="38"/>
+    <w:bookmarkStart w:id="40" w:name="cómo-leer-un-envase"/>
     <w:p>
       <w:pPr>
         <w:pStyle w:val="Heading3"/>
@@ -1427,7 +1482,7 @@
         <w:t xml:space="preserve">Mirar la porción: la información nutricional suele estar calculada por porción, no por envase completo.</w:t>
       </w:r>
     </w:p>
-    <w:bookmarkStart w:id="36" w:name="palabras-nuevas-2"/>
+    <w:bookmarkStart w:id="39" w:name="palabras-nuevas-2"/>
     <w:p>
       <w:pPr>
         <w:pStyle w:val="Heading4"/>
@@ -1526,9 +1581,9 @@
         <w:t xml:space="preserve">La cantidad que se supone que comes de una vez, no todo el paquete. Un envase de galletas puede traer cuatro porciones adentro.</w:t>
       </w:r>
     </w:p>
-    <w:bookmarkEnd w:id="36"/>
-    <w:bookmarkEnd w:id="37"/>
-    <w:bookmarkStart w:id="38" w:name="ahora-tú-1"/>
+    <w:bookmarkEnd w:id="39"/>
+    <w:bookmarkEnd w:id="40"/>
+    <w:bookmarkStart w:id="41" w:name="ahora-tú-1"/>
     <w:p>
       <w:pPr>
         <w:pStyle w:val="Heading3"/>
@@ -1644,9 +1699,9 @@
         </w:pict>
       </w:r>
     </w:p>
-    <w:bookmarkEnd w:id="38"/>
-    <w:bookmarkEnd w:id="39"/>
-    <w:bookmarkStart w:id="48" w:name="sección-3-armar-un-menú-saludable"/>
+    <w:bookmarkEnd w:id="41"/>
+    <w:bookmarkEnd w:id="42"/>
+    <w:bookmarkStart w:id="54" w:name="sección-3-armar-un-menú-saludable"/>
     <w:p>
       <w:pPr>
         <w:pStyle w:val="Heading2"/>
@@ -1655,7 +1710,7 @@
         <w:t xml:space="preserve">Sección 3 · Armar un menú saludable</w:t>
       </w:r>
     </w:p>
-    <w:bookmarkStart w:id="43" w:name="el-modelo-del-plato"/>
+    <w:bookmarkStart w:id="49" w:name="el-modelo-del-plato"/>
     <w:p>
       <w:pPr>
         <w:pStyle w:val="Heading3"/>
@@ -1876,20 +1931,75 @@
       <w:r>
         <w:drawing>
           <wp:inline>
-            <wp:extent cx="5334000" cy="3426218"/>
+            <wp:extent cx="5334000" cy="2947736"/>
             <wp:effectExtent b="0" l="0" r="0" t="0"/>
-            <wp:docPr descr="Un almuerzo armado según el modelo del plato: la mitad verduras, un cuarto proteína y un cuarto cereales o papas. Foto del USDA, dominio público." title="" id="41" name="Picture"/>
+            <wp:docPr descr="El modelo del plato: la mitad verduras y frutas, un cuarto proteínas y un cuarto cereales o papas, con agua para acompañar. Lámina hecha para esta guía." title="" id="44" name="Picture"/>
             <a:graphic>
               <a:graphicData uri="http://schemas.openxmlformats.org/drawingml/2006/picture">
                 <pic:pic>
                   <pic:nvPicPr>
-                    <pic:cNvPr descr="imagenes/plato-completo.jpg" id="42" name="Picture"/>
+                    <pic:cNvPr descr="imagenes/plato-modelo.png" id="45" name="Picture"/>
                     <pic:cNvPicPr>
                       <a:picLocks noChangeArrowheads="1" noChangeAspect="1"/>
                     </pic:cNvPicPr>
                   </pic:nvPicPr>
                   <pic:blipFill>
-                    <a:blip r:embed="rId40"/>
+                    <a:blip r:embed="rId43"/>
+                    <a:stretch>
+                      <a:fillRect/>
+                    </a:stretch>
+                  </pic:blipFill>
+                  <pic:spPr bwMode="auto">
+                    <a:xfrm>
+                      <a:off x="0" y="0"/>
+                      <a:ext cx="5334000" cy="2947736"/>
+                    </a:xfrm>
+                    <a:prstGeom prst="rect">
+                      <a:avLst/>
+                    </a:prstGeom>
+                    <a:noFill/>
+                    <a:ln w="9525">
+                      <a:noFill/>
+                      <a:headEnd/>
+                      <a:tailEnd/>
+                    </a:ln>
+                  </pic:spPr>
+                </pic:pic>
+              </a:graphicData>
+            </a:graphic>
+          </wp:inline>
+        </w:drawing>
+      </w:r>
+    </w:p>
+    <w:p>
+      <w:pPr>
+        <w:pStyle w:val="ImageCaption"/>
+      </w:pPr>
+      <w:r>
+        <w:t xml:space="preserve">El modelo del plato: la mitad verduras y frutas, un cuarto proteínas y un cuarto cereales o papas, con agua para acompañar. Lámina hecha para esta guía.</w:t>
+      </w:r>
+    </w:p>
+    <w:p>
+      <w:pPr>
+        <w:pStyle w:val="CaptionedFigure"/>
+      </w:pPr>
+      <w:r>
+        <w:drawing>
+          <wp:inline>
+            <wp:extent cx="5334000" cy="3426218"/>
+            <wp:effectExtent b="0" l="0" r="0" t="0"/>
+            <wp:docPr descr="Un almuerzo armado según el modelo del plato: la mitad verduras, un cuarto proteína y un cuarto cereales o papas. Foto del USDA, dominio público." title="" id="47" name="Picture"/>
+            <a:graphic>
+              <a:graphicData uri="http://schemas.openxmlformats.org/drawingml/2006/picture">
+                <pic:pic>
+                  <pic:nvPicPr>
+                    <pic:cNvPr descr="imagenes/plato-completo.jpg" id="48" name="Picture"/>
+                    <pic:cNvPicPr>
+                      <a:picLocks noChangeArrowheads="1" noChangeAspect="1"/>
+                    </pic:cNvPicPr>
+                  </pic:nvPicPr>
+                  <pic:blipFill>
+                    <a:blip r:embed="rId46"/>
                     <a:stretch>
                       <a:fillRect/>
                     </a:stretch>
@@ -1924,8 +2034,8 @@
         <w:t xml:space="preserve">Un almuerzo armado según el modelo del plato: la mitad verduras, un cuarto proteína y un cuarto cereales o papas. Foto del USDA, dominio público.</w:t>
       </w:r>
     </w:p>
-    <w:bookmarkEnd w:id="43"/>
-    <w:bookmarkStart w:id="44" w:name="las-cuatro-comidas-del-día"/>
+    <w:bookmarkEnd w:id="49"/>
+    <w:bookmarkStart w:id="50" w:name="las-cuatro-comidas-del-día"/>
     <w:p>
       <w:pPr>
         <w:pStyle w:val="Heading3"/>
@@ -2140,8 +2250,8 @@
         </w:tc>
       </w:tr>
     </w:tbl>
-    <w:bookmarkEnd w:id="44"/>
-    <w:bookmarkStart w:id="46" w:name="errores-frecuentes-al-armar-un-menú"/>
+    <w:bookmarkEnd w:id="50"/>
+    <w:bookmarkStart w:id="52" w:name="errores-frecuentes-al-armar-un-menú"/>
     <w:p>
       <w:pPr>
         <w:pStyle w:val="Heading3"/>
@@ -2265,7 +2375,7 @@
         <w:t xml:space="preserve">. Hay que revisar el envase.</w:t>
       </w:r>
     </w:p>
-    <w:bookmarkStart w:id="45" w:name="palabras-nuevas-3"/>
+    <w:bookmarkStart w:id="51" w:name="palabras-nuevas-3"/>
     <w:p>
       <w:pPr>
         <w:pStyle w:val="Heading4"/>
@@ -2364,9 +2474,9 @@
         <w:t xml:space="preserve">Ponerle un nombre o una etiqueta a cada parte de un dibujo, para que se entienda qué es cada cosa.</w:t>
       </w:r>
     </w:p>
-    <w:bookmarkEnd w:id="45"/>
-    <w:bookmarkEnd w:id="46"/>
-    <w:bookmarkStart w:id="47" w:name="ahora-tú-2"/>
+    <w:bookmarkEnd w:id="51"/>
+    <w:bookmarkEnd w:id="52"/>
+    <w:bookmarkStart w:id="53" w:name="ahora-tú-2"/>
     <w:p>
       <w:pPr>
         <w:pStyle w:val="Heading3"/>
@@ -2486,9 +2596,9 @@
         </w:pict>
       </w:r>
     </w:p>
-    <w:bookmarkEnd w:id="47"/>
-    <w:bookmarkEnd w:id="48"/>
-    <w:bookmarkStart w:id="58" w:name="sección-4-los-efectos-del-cigarrillo"/>
+    <w:bookmarkEnd w:id="53"/>
+    <w:bookmarkEnd w:id="54"/>
+    <w:bookmarkStart w:id="64" w:name="sección-4-los-efectos-del-cigarrillo"/>
     <w:p>
       <w:pPr>
         <w:pStyle w:val="Heading2"/>
@@ -2497,7 +2607,7 @@
         <w:t xml:space="preserve">Sección 4 · Los efectos del cigarrillo</w:t>
       </w:r>
     </w:p>
-    <w:bookmarkStart w:id="49" w:name="qué-hay-dentro-del-humo"/>
+    <w:bookmarkStart w:id="55" w:name="qué-hay-dentro-del-humo"/>
     <w:p>
       <w:pPr>
         <w:pStyle w:val="Heading3"/>
@@ -2645,8 +2755,8 @@
         </w:tc>
       </w:tr>
     </w:tbl>
-    <w:bookmarkEnd w:id="49"/>
-    <w:bookmarkStart w:id="53" w:name="qué-sistemas-se-dañan"/>
+    <w:bookmarkEnd w:id="55"/>
+    <w:bookmarkStart w:id="59" w:name="qué-sistemas-se-dañan"/>
     <w:p>
       <w:pPr>
         <w:pStyle w:val="Heading3"/>
@@ -2716,20 +2826,20 @@
       <w:r>
         <w:drawing>
           <wp:inline>
-            <wp:extent cx="4203700" cy="5588000"/>
+            <wp:extent cx="5334000" cy="3088105"/>
             <wp:effectExtent b="0" l="0" r="0" t="0"/>
-            <wp:docPr descr="Los pulmones y los bronquios que llevan el aire hasta los alvéolos. Es el sistema que más daña el humo del cigarrillo. Ilustración del NIH, dominio público." title="" id="51" name="Picture"/>
+            <wp:docPr descr="Los pulmones, la tráquea y los bronquios que llevan el aire hasta los alvéolos. Es el sistema que más daña el humo del cigarrillo. Ilustración del NIH, dominio público, rotulada para esta guía." title="" id="57" name="Picture"/>
             <a:graphic>
               <a:graphicData uri="http://schemas.openxmlformats.org/drawingml/2006/picture">
                 <pic:pic>
                   <pic:nvPicPr>
-                    <pic:cNvPr descr="imagenes/pulmones.png" id="52" name="Picture"/>
+                    <pic:cNvPr descr="imagenes/pulmones.png" id="58" name="Picture"/>
                     <pic:cNvPicPr>
                       <a:picLocks noChangeArrowheads="1" noChangeAspect="1"/>
                     </pic:cNvPicPr>
                   </pic:nvPicPr>
                   <pic:blipFill>
-                    <a:blip r:embed="rId50"/>
+                    <a:blip r:embed="rId56"/>
                     <a:stretch>
                       <a:fillRect/>
                     </a:stretch>
@@ -2737,7 +2847,7 @@
                   <pic:spPr bwMode="auto">
                     <a:xfrm>
                       <a:off x="0" y="0"/>
-                      <a:ext cx="4203700" cy="5588000"/>
+                      <a:ext cx="5334000" cy="3088105"/>
                     </a:xfrm>
                     <a:prstGeom prst="rect">
                       <a:avLst/>
@@ -2761,11 +2871,11 @@
         <w:pStyle w:val="ImageCaption"/>
       </w:pPr>
       <w:r>
-        <w:t xml:space="preserve">Los pulmones y los bronquios que llevan el aire hasta los alvéolos. Es el sistema que más daña el humo del cigarrillo. Ilustración del NIH, dominio público.</w:t>
-      </w:r>
-    </w:p>
-    <w:bookmarkEnd w:id="53"/>
-    <w:bookmarkStart w:id="54" w:name="el-fumador-pasivo"/>
+        <w:t xml:space="preserve">Los pulmones, la tráquea y los bronquios que llevan el aire hasta los alvéolos. Es el sistema que más daña el humo del cigarrillo. Ilustración del NIH, dominio público, rotulada para esta guía.</w:t>
+      </w:r>
+    </w:p>
+    <w:bookmarkEnd w:id="59"/>
+    <w:bookmarkStart w:id="60" w:name="el-fumador-pasivo"/>
     <w:p>
       <w:pPr>
         <w:pStyle w:val="Heading3"/>
@@ -2816,8 +2926,8 @@
         <w:t xml:space="preserve">, que modificó la Ley 19.419) prohíbe fumar en espacios cerrados de uso público, en establecimientos educacionales y de salud, en el transporte público y en los patios de los colegios. También obliga a los envases a llevar imágenes de advertencia.</w:t>
       </w:r>
     </w:p>
-    <w:bookmarkEnd w:id="54"/>
-    <w:bookmarkStart w:id="56" w:name="cómo-decir-que-no"/>
+    <w:bookmarkEnd w:id="60"/>
+    <w:bookmarkStart w:id="62" w:name="cómo-decir-que-no"/>
     <w:p>
       <w:pPr>
         <w:pStyle w:val="Heading3"/>
@@ -2965,7 +3075,7 @@
         <w:t xml:space="preserve">si la presión se repite.</w:t>
       </w:r>
     </w:p>
-    <w:bookmarkStart w:id="55" w:name="palabras-nuevas-4"/>
+    <w:bookmarkStart w:id="61" w:name="palabras-nuevas-4"/>
     <w:p>
       <w:pPr>
         <w:pStyle w:val="Heading4"/>
@@ -3064,9 +3174,9 @@
         <w:t xml:space="preserve">Unas bolsitas diminutas que están al final de los pulmones, donde el aire pasa a la sangre. Son como globitos que se inflan y desinflan al respirar.</w:t>
       </w:r>
     </w:p>
-    <w:bookmarkEnd w:id="55"/>
-    <w:bookmarkEnd w:id="56"/>
-    <w:bookmarkStart w:id="57" w:name="ahora-tú-3"/>
+    <w:bookmarkEnd w:id="61"/>
+    <w:bookmarkEnd w:id="62"/>
+    <w:bookmarkStart w:id="63" w:name="ahora-tú-3"/>
     <w:p>
       <w:pPr>
         <w:pStyle w:val="Heading3"/>
@@ -3166,9 +3276,9 @@
         </w:pict>
       </w:r>
     </w:p>
-    <w:bookmarkEnd w:id="57"/>
-    <w:bookmarkEnd w:id="58"/>
-    <w:bookmarkStart w:id="60" w:name="actividad-central-la-campaña-de-curso"/>
+    <w:bookmarkEnd w:id="63"/>
+    <w:bookmarkEnd w:id="64"/>
+    <w:bookmarkStart w:id="66" w:name="actividad-central-la-campaña-de-curso"/>
     <w:p>
       <w:pPr>
         <w:pStyle w:val="Heading2"/>
@@ -3177,7 +3287,7 @@
         <w:t xml:space="preserve">Actividad central · La campaña de curso</w:t>
       </w:r>
     </w:p>
-    <w:bookmarkStart w:id="59" w:name="palabras-nuevas-5"/>
+    <w:bookmarkStart w:id="65" w:name="palabras-nuevas-5"/>
     <w:p>
       <w:pPr>
         <w:pStyle w:val="Heading4"/>
@@ -3337,9 +3447,9 @@
         </w:pict>
       </w:r>
     </w:p>
-    <w:bookmarkEnd w:id="59"/>
-    <w:bookmarkEnd w:id="60"/>
-    <w:bookmarkStart w:id="62" w:name="evaluación-integradora"/>
+    <w:bookmarkEnd w:id="65"/>
+    <w:bookmarkEnd w:id="66"/>
+    <w:bookmarkStart w:id="68" w:name="evaluación-integradora"/>
     <w:p>
       <w:pPr>
         <w:pStyle w:val="Heading2"/>
@@ -3348,7 +3458,7 @@
         <w:t xml:space="preserve">Evaluación integradora</w:t>
       </w:r>
     </w:p>
-    <w:bookmarkStart w:id="61" w:name="palabras-nuevas-6"/>
+    <w:bookmarkStart w:id="67" w:name="palabras-nuevas-6"/>
     <w:p>
       <w:pPr>
         <w:pStyle w:val="Heading4"/>
@@ -3555,10 +3665,10 @@
         <w:br w:type="page"/>
       </w:r>
     </w:p>
-    <w:bookmarkEnd w:id="61"/>
-    <w:bookmarkEnd w:id="62"/>
-    <w:bookmarkEnd w:id="63"/>
-    <w:bookmarkStart w:id="72" w:name="solucionario-guía-3-ciencias-naturales"/>
+    <w:bookmarkEnd w:id="67"/>
+    <w:bookmarkEnd w:id="68"/>
+    <w:bookmarkEnd w:id="69"/>
+    <w:bookmarkStart w:id="78" w:name="solucionario-guía-3-ciencias-naturales"/>
     <w:p>
       <w:pPr>
         <w:pStyle w:val="Heading1"/>
@@ -3585,7 +3695,7 @@
         <w:t xml:space="preserve">Esta sección no debe entregarse junto con la guía de trabajo.</w:t>
       </w:r>
     </w:p>
-    <w:bookmarkStart w:id="64" w:name="diagnóstico-de-entrada-1"/>
+    <w:bookmarkStart w:id="70" w:name="diagnóstico-de-entrada-1"/>
     <w:p>
       <w:pPr>
         <w:pStyle w:val="Heading2"/>
@@ -3690,8 +3800,8 @@
         <w:t xml:space="preserve">Por la nicotina, que produce adicción.</w:t>
       </w:r>
     </w:p>
-    <w:bookmarkEnd w:id="64"/>
-    <w:bookmarkStart w:id="65" w:name="sección-1-ahora-tú"/>
+    <w:bookmarkEnd w:id="70"/>
+    <w:bookmarkStart w:id="71" w:name="sección-1-ahora-tú"/>
     <w:p>
       <w:pPr>
         <w:pStyle w:val="Heading2"/>
@@ -3760,8 +3870,8 @@
         <w:t xml:space="preserve">Respuesta personal. Se evalúa que registre datos concretos y los compare con las recomendaciones de la tabla.</w:t>
       </w:r>
     </w:p>
-    <w:bookmarkEnd w:id="65"/>
-    <w:bookmarkStart w:id="66" w:name="sección-2-ahora-tú"/>
+    <w:bookmarkEnd w:id="71"/>
+    <w:bookmarkStart w:id="72" w:name="sección-2-ahora-tú"/>
     <w:p>
       <w:pPr>
         <w:pStyle w:val="Heading2"/>
@@ -3842,8 +3952,8 @@
         <w:t xml:space="preserve">Respuesta personal. Se evalúa la observación correcta de los envases.</w:t>
       </w:r>
     </w:p>
-    <w:bookmarkEnd w:id="66"/>
-    <w:bookmarkStart w:id="67" w:name="sección-3-ahora-tú"/>
+    <w:bookmarkEnd w:id="72"/>
+    <w:bookmarkStart w:id="73" w:name="sección-3-ahora-tú"/>
     <w:p>
       <w:pPr>
         <w:pStyle w:val="Heading2"/>
@@ -3930,8 +4040,8 @@
         <w:t xml:space="preserve">Respuesta personal. Se evalúa que las cuatro comidas estén completas, que el almuerzo respete el modelo del plato y que aparezcan frutas y verduras en más de una comida.</w:t>
       </w:r>
     </w:p>
-    <w:bookmarkEnd w:id="67"/>
-    <w:bookmarkStart w:id="68" w:name="sección-4-ahora-tú"/>
+    <w:bookmarkEnd w:id="73"/>
+    <w:bookmarkStart w:id="74" w:name="sección-4-ahora-tú"/>
     <w:p>
       <w:pPr>
         <w:pStyle w:val="Heading2"/>
@@ -4024,8 +4134,8 @@
         <w:t xml:space="preserve">Respuesta abierta. Se evalúa que sean respuestas directas y sin justificaciones extensas.</w:t>
       </w:r>
     </w:p>
-    <w:bookmarkEnd w:id="68"/>
-    <w:bookmarkStart w:id="69" w:name="actividad-central"/>
+    <w:bookmarkEnd w:id="74"/>
+    <w:bookmarkStart w:id="75" w:name="actividad-central"/>
     <w:p>
       <w:pPr>
         <w:pStyle w:val="Heading2"/>
@@ -4213,8 +4323,8 @@
         </w:tc>
       </w:tr>
     </w:tbl>
-    <w:bookmarkEnd w:id="69"/>
-    <w:bookmarkStart w:id="70" w:name="evaluación-integradora-1"/>
+    <w:bookmarkEnd w:id="75"/>
+    <w:bookmarkStart w:id="76" w:name="evaluación-integradora-1"/>
     <w:p>
       <w:pPr>
         <w:pStyle w:val="Heading2"/>
@@ -4367,8 +4477,8 @@
         <w:t xml:space="preserve">Decir que no directamente, dar una razón propia, cambiar de tema o de lugar, rodearse de amigos que no fuman, contarle a un adulto de confianza.</w:t>
       </w:r>
     </w:p>
-    <w:bookmarkEnd w:id="70"/>
-    <w:bookmarkStart w:id="71" w:name="tabla-de-remediación"/>
+    <w:bookmarkEnd w:id="76"/>
+    <w:bookmarkStart w:id="77" w:name="tabla-de-remediación"/>
     <w:p>
       <w:pPr>
         <w:pStyle w:val="Heading2"/>
@@ -4639,8 +4749,8 @@
         <w:t xml:space="preserve">10 o más indica dominio del contenido; entre 7 y 9, repaso focalizado; menos de 7, rehacer las secciones marcadas.</w:t>
       </w:r>
     </w:p>
-    <w:bookmarkEnd w:id="71"/>
-    <w:bookmarkEnd w:id="72"/>
+    <w:bookmarkEnd w:id="77"/>
+    <w:bookmarkEnd w:id="78"/>
     <w:sectPr/>
   </w:body>
 </w:document>

</xml_diff>